<commit_message>
dodanie punkut 1. do sprawozadania końcowego
</commit_message>
<xml_diff>
--- a/TK/sprawozdanie.docx
+++ b/TK/sprawozdanie.docx
@@ -4,7 +4,6 @@
   <w:body>
     <w:tbl>
       <w:tblPr>
-        <w:tblStyle w:val="TableNormal"/>
         <w:tblW w:w="0" w:type="auto"/>
         <w:tblBorders>
           <w:top w:val="single" w:sz="4" w:space="0" w:color="auto"/>
@@ -222,16 +221,8 @@
               <w:rPr>
                 <w:rFonts w:ascii="Aptos" w:eastAsia="Aptos" w:hAnsi="Aptos"/>
               </w:rPr>
-              <w:t xml:space="preserve">Mikołaj </w:t>
+              <w:t>Mikołaj Staniaszek</w:t>
             </w:r>
-            <w:proofErr w:type="spellStart"/>
-            <w:r>
-              <w:rPr>
-                <w:rFonts w:ascii="Aptos" w:eastAsia="Aptos" w:hAnsi="Aptos"/>
-              </w:rPr>
-              <w:t>Staniaszek</w:t>
-            </w:r>
-            <w:proofErr w:type="spellEnd"/>
           </w:p>
           <w:p>
             <w:pPr>
@@ -263,16 +254,8 @@
               <w:rPr>
                 <w:rFonts w:ascii="Aptos" w:eastAsia="Aptos" w:hAnsi="Aptos"/>
               </w:rPr>
-              <w:t xml:space="preserve">. Tomasz </w:t>
+              <w:t>. Tomasz Hordjewicz</w:t>
             </w:r>
-            <w:proofErr w:type="spellStart"/>
-            <w:r>
-              <w:rPr>
-                <w:rFonts w:ascii="Aptos" w:eastAsia="Aptos" w:hAnsi="Aptos"/>
-              </w:rPr>
-              <w:t>Hordjewicz</w:t>
-            </w:r>
-            <w:proofErr w:type="spellEnd"/>
           </w:p>
         </w:tc>
       </w:tr>
@@ -280,10 +263,10 @@
     <w:p/>
     <w:p>
       <w:pPr>
-        <w:pStyle w:val="Akapitzlist"/>
+        <w:pStyle w:val="ListParagraph"/>
         <w:numPr>
           <w:ilvl w:val="1"/>
-          <w:numId w:val="7"/>
+          <w:numId w:val="8"/>
         </w:numPr>
         <w:rPr>
           <w:rFonts w:ascii="Aptos" w:eastAsia="Aptos" w:hAnsi="Aptos" w:cs="Aptos"/>
@@ -298,12 +281,12 @@
     </w:p>
     <w:p>
       <w:pPr>
-        <w:pStyle w:val="Akapitzlist"/>
-      </w:pPr>
-    </w:p>
-    <w:p>
-      <w:pPr>
-        <w:pStyle w:val="Akapitzlist"/>
+        <w:pStyle w:val="ListParagraph"/>
+      </w:pPr>
+    </w:p>
+    <w:p>
+      <w:pPr>
+        <w:pStyle w:val="ListParagraph"/>
         <w:rPr>
           <w:b/>
           <w:bCs/>
@@ -326,66 +309,58 @@
     </w:p>
     <w:p>
       <w:pPr>
-        <w:pStyle w:val="Akapitzlist"/>
-        <w:rPr>
-          <w:b/>
-          <w:bCs/>
-        </w:rPr>
-      </w:pPr>
-    </w:p>
-    <w:p>
-      <w:pPr>
-        <w:pStyle w:val="Akapitzlist"/>
-        <w:rPr>
-          <w:b/>
-          <w:bCs/>
-        </w:rPr>
-      </w:pPr>
-      <w:r>
-        <w:rPr>
-          <w:b/>
-          <w:bCs/>
-        </w:rPr>
-        <w:t xml:space="preserve">Mikołaj </w:t>
-      </w:r>
-      <w:proofErr w:type="spellStart"/>
-      <w:r>
-        <w:rPr>
-          <w:b/>
-          <w:bCs/>
-        </w:rPr>
-        <w:t>Staniaszek</w:t>
-      </w:r>
-      <w:proofErr w:type="spellEnd"/>
-      <w:r>
-        <w:rPr>
-          <w:b/>
-          <w:bCs/>
-        </w:rPr>
-        <w:t xml:space="preserve"> -</w:t>
-      </w:r>
-    </w:p>
-    <w:p>
-      <w:pPr>
-        <w:pStyle w:val="Akapitzlist"/>
-        <w:rPr>
-          <w:b/>
-          <w:bCs/>
-        </w:rPr>
-      </w:pPr>
-    </w:p>
-    <w:p>
-      <w:pPr>
-        <w:pStyle w:val="Akapitzlist"/>
-        <w:rPr>
-          <w:b/>
-          <w:bCs/>
-        </w:rPr>
-      </w:pPr>
-    </w:p>
-    <w:p>
-      <w:pPr>
-        <w:pStyle w:val="Akapitzlist"/>
+        <w:pStyle w:val="ListParagraph"/>
+        <w:ind w:firstLine="696"/>
+        <w:rPr>
+          <w:b/>
+          <w:bCs/>
+        </w:rPr>
+      </w:pPr>
+      <w:r>
+        <w:rPr>
+          <w:b/>
+          <w:bCs/>
+        </w:rPr>
+        <w:t>Punkty (1)</w:t>
+      </w:r>
+    </w:p>
+    <w:p>
+      <w:pPr>
+        <w:pStyle w:val="ListParagraph"/>
+        <w:rPr>
+          <w:b/>
+          <w:bCs/>
+        </w:rPr>
+      </w:pPr>
+      <w:r>
+        <w:rPr>
+          <w:b/>
+          <w:bCs/>
+        </w:rPr>
+        <w:t>Mikołaj Staniaszek -</w:t>
+      </w:r>
+    </w:p>
+    <w:p>
+      <w:pPr>
+        <w:pStyle w:val="ListParagraph"/>
+        <w:rPr>
+          <w:b/>
+          <w:bCs/>
+        </w:rPr>
+      </w:pPr>
+    </w:p>
+    <w:p>
+      <w:pPr>
+        <w:pStyle w:val="ListParagraph"/>
+        <w:rPr>
+          <w:b/>
+          <w:bCs/>
+        </w:rPr>
+      </w:pPr>
+    </w:p>
+    <w:p>
+      <w:pPr>
+        <w:pStyle w:val="ListParagraph"/>
         <w:rPr>
           <w:b/>
           <w:bCs/>
@@ -415,7 +390,7 @@
     </w:p>
     <w:p>
       <w:pPr>
-        <w:pStyle w:val="Akapitzlist"/>
+        <w:pStyle w:val="ListParagraph"/>
         <w:rPr>
           <w:b/>
           <w:bCs/>
@@ -473,10 +448,10 @@
     </w:p>
     <w:p>
       <w:pPr>
-        <w:pStyle w:val="Akapitzlist"/>
+        <w:pStyle w:val="ListParagraph"/>
         <w:numPr>
           <w:ilvl w:val="1"/>
-          <w:numId w:val="7"/>
+          <w:numId w:val="8"/>
         </w:numPr>
         <w:rPr>
           <w:rFonts w:ascii="Aptos" w:eastAsia="Aptos" w:hAnsi="Aptos" w:cs="Aptos"/>
@@ -491,7 +466,7 @@
     </w:p>
     <w:p>
       <w:pPr>
-        <w:pStyle w:val="Akapitzlist"/>
+        <w:pStyle w:val="ListParagraph"/>
         <w:rPr>
           <w:b/>
           <w:bCs/>
@@ -520,23 +495,214 @@
       <w:hyperlink r:id="rId9">
         <w:r>
           <w:rPr>
-            <w:rStyle w:val="Hipercze"/>
+            <w:rStyle w:val="Hyperlink"/>
           </w:rPr>
           <w:t>https://github.com/stomczak11/inzynieria-oprogramowania-projekt</w:t>
         </w:r>
       </w:hyperlink>
     </w:p>
     <w:p/>
+    <w:p>
+      <w:r>
+        <w:br w:type="page"/>
+      </w:r>
+    </w:p>
+    <w:p>
+      <w:pPr>
+        <w:pStyle w:val="Heading1"/>
+        <w:numPr>
+          <w:ilvl w:val="0"/>
+          <w:numId w:val="1"/>
+        </w:numPr>
+        <w:rPr>
+          <w:rFonts w:ascii="Aptos Display" w:eastAsia="Aptos Display" w:hAnsi="Aptos Display" w:cs="Aptos Display"/>
+          <w:color w:val="000000" w:themeColor="text1"/>
+        </w:rPr>
+      </w:pPr>
+      <w:r>
+        <w:rPr>
+          <w:rFonts w:ascii="Aptos Display" w:eastAsia="Aptos Display" w:hAnsi="Aptos Display" w:cs="Aptos Display"/>
+          <w:color w:val="000000" w:themeColor="text1"/>
+        </w:rPr>
+        <w:t>System zarządzania akademią piłkarską "FC Drewno Academy"</w:t>
+      </w:r>
+    </w:p>
+    <w:p>
+      <w:pPr>
+        <w:rPr>
+          <w:rFonts w:ascii="Aptos" w:eastAsia="Aptos" w:hAnsi="Aptos" w:cs="Aptos"/>
+          <w:color w:val="000000" w:themeColor="text1"/>
+        </w:rPr>
+      </w:pPr>
+      <w:r>
+        <w:rPr>
+          <w:rFonts w:ascii="Aptos" w:eastAsia="Aptos" w:hAnsi="Aptos" w:cs="Aptos"/>
+          <w:color w:val="000000" w:themeColor="text1"/>
+        </w:rPr>
+        <w:t>Opis zadania: Akademia Piłkarska "FC Drewno Academy" prowadzi profesjonalne szkolenie sportowe dzieci i młodzieży na terenie całego województwa. Ośrodek funkcjonuje nieprzerwanie od 2015 roku. Dzięki innowacyjnemu podejściu do metodologii treningowej oraz zatrudnianiu wyłącznie licencjonowanych trenerów, klub szybko zyskał miano jednego z liderów w swoim regionie.</w:t>
+      </w:r>
+    </w:p>
+    <w:p>
+      <w:pPr>
+        <w:rPr>
+          <w:rFonts w:ascii="Aptos" w:eastAsia="Aptos" w:hAnsi="Aptos" w:cs="Aptos"/>
+          <w:color w:val="000000" w:themeColor="text1"/>
+        </w:rPr>
+      </w:pPr>
+      <w:r>
+        <w:rPr>
+          <w:rFonts w:ascii="Aptos" w:eastAsia="Aptos" w:hAnsi="Aptos" w:cs="Aptos"/>
+          <w:color w:val="000000" w:themeColor="text1"/>
+        </w:rPr>
+        <w:t>Dotychczasowy model zarządzania akademią opiera się w dużej mierze na dokumentacji papierowej i ręcznej obsłudze. Proces naboru wymaga od rodziców bezpośredniego lub telefonicznego kontaktu z biurem w celu dopasowania dziecka do odpowiedniej grupy. Formalności, takie jak wypełnienie deklaracji członkowskiej czy opłata wpisowego, załatwiane są osobiście u trenera przed pierwszymi zajęciami. Szkoleniowcy weryfikują obecność na podstawie wydrukowanych list, które po zakończeniu miesiąca trafiają do działu administracji. Pracownicy księgowości muszą następnie ręcznie zestawiać papierowe obecności z wyciągami bankowymi, aby kontrolować wpłaty składek. Wszelkie opóźnienia w płatnościach wiążą się z koniecznością uciążliwego, telefonicznego upominania rodziców. Ponadto, w przypadku rezygnacji zawodnika z członkostwa, akademia musi monitorować proces zwrotu wypożyczonego sprzętu sportowego.</w:t>
+      </w:r>
+    </w:p>
+    <w:p>
+      <w:pPr>
+        <w:rPr>
+          <w:rFonts w:ascii="Aptos" w:eastAsia="Aptos" w:hAnsi="Aptos" w:cs="Aptos"/>
+          <w:color w:val="000000" w:themeColor="text1"/>
+        </w:rPr>
+      </w:pPr>
+      <w:r>
+        <w:rPr>
+          <w:rFonts w:ascii="Aptos" w:eastAsia="Aptos" w:hAnsi="Aptos" w:cs="Aptos"/>
+          <w:color w:val="000000" w:themeColor="text1"/>
+        </w:rPr>
+        <w:t>Kluczowym obiektem w strukturze klubu jest Zawodnik, którego profil w kartotece zawiera: imię, nazwisko, numer PESEL, datę urodzenia, wyniki testów sprawnościowych, pozycję zawodnika, statystyki przebytych gier (ilość strzelonych bramek, ilość wpuszczonych bramek w przypadku bramkarza, ilość czerwonych kartek, ilość żółtych kartek), adres zamieszkania oraz dane kontaktowe (telefon, e-mail) do przynajmniej jednego opiekuna prawnego. Adepci przydzielani są do zdefiniowanych kategorii wiekowych (np. Skrzat, Żak, Orlik, Młodzik). Klub musi również rygorystycznie pilnować dat ważności obowiązkowych badań lekarskich, które należy odnawiać co 6 miesięcy. Struktura organizacyjna zakłada ponadto przypisanie każdego trenera do konkretnych grup szkoleniowych oraz obiektów sportowych (boiska, hale), na których odbywają się jednostki treningowe.</w:t>
+      </w:r>
+    </w:p>
+    <w:p>
+      <w:pPr>
+        <w:rPr>
+          <w:rFonts w:ascii="Aptos" w:eastAsia="Aptos" w:hAnsi="Aptos" w:cs="Aptos"/>
+          <w:color w:val="000000" w:themeColor="text1"/>
+        </w:rPr>
+      </w:pPr>
+      <w:r>
+        <w:rPr>
+          <w:rFonts w:ascii="Aptos" w:eastAsia="Aptos" w:hAnsi="Aptos" w:cs="Aptos"/>
+          <w:color w:val="000000" w:themeColor="text1"/>
+        </w:rPr>
+        <w:t>W odpowiedzi na rosnącą liczbę podopiecznych i chęć profesjonalizacji usług, zarząd "FC Drewno Academy" podjął decyzję o wdrożeniu dedykowanego systemu informatycznego. Nowe oprogramowanie (składające się z portalu webowego oraz aplikacji mobilnej) zautomatyzuje kluczowe procesy w klubie. Rodzice zyskają możliwość elektronicznej rejestracji dziecka na zajęcia, opłacania składek przez zintegrowaną bramkę płatności, a także stałego podglądu harmonogramu i statystyków odbytych meczów.</w:t>
+      </w:r>
+    </w:p>
+    <w:p>
+      <w:pPr>
+        <w:rPr>
+          <w:rFonts w:ascii="Aptos" w:eastAsia="Aptos" w:hAnsi="Aptos" w:cs="Aptos"/>
+          <w:color w:val="000000" w:themeColor="text1"/>
+        </w:rPr>
+      </w:pPr>
+      <w:r>
+        <w:rPr>
+          <w:rFonts w:ascii="Aptos" w:eastAsia="Aptos" w:hAnsi="Aptos" w:cs="Aptos"/>
+          <w:color w:val="000000" w:themeColor="text1"/>
+        </w:rPr>
+        <w:t>Dla trenerów zaprojektowano moduł mobilny, umożliwiający ewidencjonowanie frekwencji bezpośrednio na boisku z poziomu smartfona, co całkowicie wyeliminuje obieg papierowy. System usprawni też komunikację kryzysową, w razie nagłego załamania pogody, szkoleniowiec za pomocą jednego kliknięcia wyśle zbiorcze powiadomienie (SMS/e-mail) o odwołaniu treningu. Docelowo, wdrożenie tego rozwiązania ma przynieść znaczną oszczędność czasu kadry, poprawę płynności finansowej z tytułu składek oraz dostarczyć zarządowi zaawansowanych statystyk niezbędnych do dalszego rozwoju akademii. Dodatkowo, wprowadzony zostanie zaawansowany Moduł Zarządzania Składami Meczowymi, który umożliwi trenerom efektywny dobór zawodników na mecze ligowe i wyjazdowe. Trener, korzystając z aplikacji mobilnej lub portalu webowego, będzie mógł tworzyć wydarzenia meczowe, a następnie selekcjonować skład w oparciu o zintegrowane dane z kartoteki zawodnika, takie jak: pozycja na boisku oraz bieżące statystyki z odbytych gier (np. liczba strzelonych bramek, otrzymane kartki). Po zatwierdzeniu składu, system automatycznie wyśle do opiekunów prawnych powołanych zawodników natychmiastowe powiadomienia (SMS/e-mail) zawierające szczegółowe informacje logistyczne, takie jak: data, godzina i miejsce zbiórki/wyjazdu na mecz. Rodzic z kolei otrzyma możliwość szybkiego potwierdzenia lub odmowy udziału, co pozwoli trenerowi na bieżące zarządzanie kadrą.</w:t>
+      </w:r>
+    </w:p>
+    <w:p>
+      <w:r>
+        <w:br w:type="page"/>
+      </w:r>
+    </w:p>
+    <w:p>
+      <w:pPr>
+        <w:spacing w:after="0"/>
+      </w:pPr>
+      <w:r>
+        <w:t>Stanisław Tomczak</w:t>
+      </w:r>
+    </w:p>
+    <w:p>
+      <w:pPr>
+        <w:spacing w:after="0"/>
+      </w:pPr>
+      <w:r>
+        <w:t>Maciej Lachowicz</w:t>
+      </w:r>
+    </w:p>
+    <w:p>
+      <w:pPr>
+        <w:spacing w:after="0"/>
+      </w:pPr>
+      <w:r>
+        <w:t>Mikołaj Staniaszek</w:t>
+      </w:r>
+    </w:p>
     <w:p/>
-    <w:p/>
-    <w:p/>
-    <w:p/>
-    <w:p/>
-    <w:p>
-      <w:pPr>
-        <w:spacing w:after="0"/>
-      </w:pPr>
-      <w:r>
+    <w:p>
+      <w:pPr>
+        <w:jc w:val="center"/>
+        <w:rPr>
+          <w:sz w:val="36"/>
+          <w:szCs w:val="36"/>
+        </w:rPr>
+      </w:pPr>
+      <w:r>
+        <w:rPr>
+          <w:b/>
+          <w:bCs/>
+          <w:sz w:val="36"/>
+          <w:szCs w:val="36"/>
+        </w:rPr>
+        <w:t>Sprawozdanie z wymagań i zakresu projektu</w:t>
+      </w:r>
+    </w:p>
+    <w:p>
+      <w:pPr>
+        <w:jc w:val="center"/>
+        <w:rPr>
+          <w:sz w:val="36"/>
+          <w:szCs w:val="36"/>
+        </w:rPr>
+      </w:pPr>
+      <w:r>
+        <w:rPr>
+          <w:sz w:val="36"/>
+          <w:szCs w:val="36"/>
+        </w:rPr>
+        <w:t>System zarządzania akademią piłkarską „FC Drewno Academy”</w:t>
+      </w:r>
+    </w:p>
+    <w:p>
+      <w:pPr>
+        <w:jc w:val="center"/>
+        <w:rPr>
+          <w:sz w:val="36"/>
+          <w:szCs w:val="36"/>
+        </w:rPr>
+      </w:pPr>
+    </w:p>
+    <w:p>
+      <w:pPr>
+        <w:jc w:val="center"/>
+        <w:rPr>
+          <w:sz w:val="36"/>
+          <w:szCs w:val="36"/>
+        </w:rPr>
+      </w:pPr>
+      <w:r>
+        <w:rPr>
+          <w:sz w:val="36"/>
+          <w:szCs w:val="36"/>
+        </w:rPr>
+        <w:t>Punkt 2 i 5.4</w:t>
+      </w:r>
+    </w:p>
+    <w:p>
+      <w:pPr>
+        <w:rPr>
+          <w:sz w:val="36"/>
+          <w:szCs w:val="36"/>
+        </w:rPr>
+      </w:pPr>
+      <w:r>
+        <w:rPr>
+          <w:sz w:val="36"/>
+          <w:szCs w:val="36"/>
+        </w:rPr>
         <w:br w:type="page"/>
       </w:r>
     </w:p>
@@ -552,7 +718,6 @@
           <w:b/>
           <w:bCs/>
         </w:rPr>
-        <w:lastRenderedPageBreak/>
         <w:t>2</w:t>
       </w:r>
       <w:r>
@@ -565,15 +730,7 @@
     </w:p>
     <w:p>
       <w:r>
-        <w:t xml:space="preserve">Celem budowy systemu informatycznego dla FC Drewno </w:t>
-      </w:r>
-      <w:proofErr w:type="spellStart"/>
-      <w:r>
-        <w:t>Academy</w:t>
-      </w:r>
-      <w:proofErr w:type="spellEnd"/>
-      <w:r>
-        <w:t xml:space="preserve"> jest </w:t>
+        <w:t xml:space="preserve">Celem budowy systemu informatycznego dla FC Drewno Academy jest </w:t>
       </w:r>
       <w:r>
         <w:rPr>
@@ -613,6 +770,321 @@
           <w:bCs/>
         </w:rPr>
         <w:t>. ZAKRES FUNKCJONALNY SYSTEMU</w:t>
+      </w:r>
+    </w:p>
+    <w:p>
+      <w:pPr>
+        <w:numPr>
+          <w:ilvl w:val="0"/>
+          <w:numId w:val="4"/>
+        </w:numPr>
+      </w:pPr>
+      <w:r>
+        <w:rPr>
+          <w:b/>
+          <w:bCs/>
+        </w:rPr>
+        <w:t>Moduł rejestracji i zarządzania zawodnikami</w:t>
+      </w:r>
+      <w:r>
+        <w:t xml:space="preserve"> – elektroniczna rejestracja dzieci przez rodziców, zarządzanie kartoteką zawodnika (dane osobowe, PESEL, dane opiekunów, kategoria wiekowa, pozycja na boisku)</w:t>
+      </w:r>
+    </w:p>
+    <w:p>
+      <w:pPr>
+        <w:numPr>
+          <w:ilvl w:val="0"/>
+          <w:numId w:val="4"/>
+        </w:numPr>
+      </w:pPr>
+      <w:r>
+        <w:rPr>
+          <w:b/>
+          <w:bCs/>
+        </w:rPr>
+        <w:t>Moduł płatności</w:t>
+      </w:r>
+      <w:r>
+        <w:t xml:space="preserve"> – zintegrowana bramka płatnicza umożliwiająca opłacanie wpisowego i składek członkowskich online</w:t>
+      </w:r>
+    </w:p>
+    <w:p>
+      <w:pPr>
+        <w:numPr>
+          <w:ilvl w:val="0"/>
+          <w:numId w:val="4"/>
+        </w:numPr>
+      </w:pPr>
+      <w:r>
+        <w:rPr>
+          <w:b/>
+          <w:bCs/>
+        </w:rPr>
+        <w:t>Moduł harmonogramów i statystyk</w:t>
+      </w:r>
+      <w:r>
+        <w:t xml:space="preserve"> – podgląd planu treningów, statystyk meczowych zawodnika (bramki, kartki)</w:t>
+      </w:r>
+    </w:p>
+    <w:p>
+      <w:pPr>
+        <w:numPr>
+          <w:ilvl w:val="0"/>
+          <w:numId w:val="4"/>
+        </w:numPr>
+      </w:pPr>
+      <w:r>
+        <w:rPr>
+          <w:b/>
+          <w:bCs/>
+        </w:rPr>
+        <w:t>Moduł zarządzania badaniami lekarskimi</w:t>
+      </w:r>
+      <w:r>
+        <w:t xml:space="preserve"> – monitoring ważności obowiązkowych badań (odnawianych co 6 miesięcy)</w:t>
+      </w:r>
+    </w:p>
+    <w:p>
+      <w:pPr>
+        <w:numPr>
+          <w:ilvl w:val="0"/>
+          <w:numId w:val="4"/>
+        </w:numPr>
+      </w:pPr>
+      <w:r>
+        <w:rPr>
+          <w:b/>
+          <w:bCs/>
+        </w:rPr>
+        <w:t>Moduł zarządzania sprzętem</w:t>
+      </w:r>
+      <w:r>
+        <w:t xml:space="preserve"> – ewidencja wypożyczonego sprzętu sportowego i kontrola zwrotów</w:t>
+      </w:r>
+    </w:p>
+    <w:p>
+      <w:pPr>
+        <w:numPr>
+          <w:ilvl w:val="0"/>
+          <w:numId w:val="4"/>
+        </w:numPr>
+      </w:pPr>
+      <w:r>
+        <w:rPr>
+          <w:b/>
+          <w:bCs/>
+        </w:rPr>
+        <w:t>Moduł zarządzania składami meczowymi</w:t>
+      </w:r>
+      <w:r>
+        <w:t xml:space="preserve"> – tworzenie wydarzeń meczowych, selekcja zawodników, generowanie powiadomień dla rodziców</w:t>
+      </w:r>
+    </w:p>
+    <w:p>
+      <w:pPr>
+        <w:numPr>
+          <w:ilvl w:val="0"/>
+          <w:numId w:val="6"/>
+        </w:numPr>
+      </w:pPr>
+      <w:r>
+        <w:rPr>
+          <w:b/>
+          <w:bCs/>
+        </w:rPr>
+        <w:t>Moduł ewidencji frekwencji</w:t>
+      </w:r>
+      <w:r>
+        <w:t xml:space="preserve"> – rejestracja obecności bezpośrednio z boiska w czasie rzeczywistym</w:t>
+      </w:r>
+    </w:p>
+    <w:p>
+      <w:pPr>
+        <w:numPr>
+          <w:ilvl w:val="0"/>
+          <w:numId w:val="6"/>
+        </w:numPr>
+      </w:pPr>
+      <w:r>
+        <w:rPr>
+          <w:b/>
+          <w:bCs/>
+        </w:rPr>
+        <w:t>Moduł komunikacji kryzysowej</w:t>
+      </w:r>
+      <w:r>
+        <w:t xml:space="preserve"> – zbiorcze powiadomienia SMS/e-mail o odwołaniu treningów</w:t>
+      </w:r>
+    </w:p>
+    <w:p>
+      <w:pPr>
+        <w:numPr>
+          <w:ilvl w:val="0"/>
+          <w:numId w:val="6"/>
+        </w:numPr>
+      </w:pPr>
+      <w:r>
+        <w:rPr>
+          <w:b/>
+          <w:bCs/>
+        </w:rPr>
+        <w:t>Moduł przypisań</w:t>
+      </w:r>
+      <w:r>
+        <w:t xml:space="preserve"> – zarządzanie przypisaniem trenerów do grup szkoleniowych i obiektów sportowych</w:t>
+      </w:r>
+    </w:p>
+    <w:p>
+      <w:pPr>
+        <w:rPr>
+          <w:b/>
+          <w:bCs/>
+        </w:rPr>
+      </w:pPr>
+      <w:r>
+        <w:rPr>
+          <w:b/>
+          <w:bCs/>
+        </w:rPr>
+        <w:br w:type="page"/>
+      </w:r>
+    </w:p>
+    <w:p>
+      <w:pPr>
+        <w:rPr>
+          <w:b/>
+          <w:bCs/>
+        </w:rPr>
+      </w:pPr>
+      <w:r>
+        <w:rPr>
+          <w:b/>
+          <w:bCs/>
+        </w:rPr>
+        <w:t>2.2</w:t>
+      </w:r>
+      <w:r>
+        <w:rPr>
+          <w:b/>
+          <w:bCs/>
+        </w:rPr>
+        <w:t>. KONTEKST WDROŻENIA</w:t>
+      </w:r>
+    </w:p>
+    <w:p>
+      <w:r>
+        <w:t>Akademia Piłkarska "FC Drewno Academy" prowadzi profesjonalne szkolenie dzieci i młodzieży od 2015 roku. Dynamiczny rozwój klubu i stale rosnąca liczba podopiecznych sprawiły, że dotychczasowy, oparty na papierze model zarządzania stał się niewydolny. Procesy takie jak ręczne zestawianie obecności z wyciągami bankowymi czy uciążliwe, telefoniczne upominanie rodziców o składki zaczęły generować straty czasu oraz opóźnienia w płatnościach</w:t>
+      </w:r>
+      <w:r>
+        <w:t>.</w:t>
+      </w:r>
+    </w:p>
+    <w:p>
+      <w:pPr>
+        <w:rPr>
+          <w:b/>
+          <w:bCs/>
+        </w:rPr>
+      </w:pPr>
+      <w:r>
+        <w:rPr>
+          <w:b/>
+          <w:bCs/>
+        </w:rPr>
+        <w:t>2.3</w:t>
+      </w:r>
+      <w:r>
+        <w:rPr>
+          <w:b/>
+          <w:bCs/>
+        </w:rPr>
+        <w:t>. PRZEWIDYWALNE KORZYŚCI Z WDROŻENIA</w:t>
+      </w:r>
+    </w:p>
+    <w:p>
+      <w:pPr>
+        <w:rPr>
+          <w:b/>
+          <w:bCs/>
+        </w:rPr>
+      </w:pPr>
+      <w:r>
+        <w:rPr>
+          <w:b/>
+          <w:bCs/>
+        </w:rPr>
+        <w:t>2.3</w:t>
+      </w:r>
+      <w:r>
+        <w:rPr>
+          <w:b/>
+          <w:bCs/>
+        </w:rPr>
+        <w:t>.1. KORZYŚCI MIERZALNE</w:t>
+      </w:r>
+    </w:p>
+    <w:p>
+      <w:r>
+        <w:t>Oszczędność czasu</w:t>
+      </w:r>
+    </w:p>
+    <w:p>
+      <w:pPr>
+        <w:numPr>
+          <w:ilvl w:val="0"/>
+          <w:numId w:val="2"/>
+        </w:numPr>
+      </w:pPr>
+      <w:r>
+        <w:t xml:space="preserve">Administracja: zamiast 30 godzin/miesiąc na ręczne zestawianie list i płatności → 0 godzin (wszystko automatycznie) </w:t>
+      </w:r>
+    </w:p>
+    <w:p>
+      <w:pPr>
+        <w:numPr>
+          <w:ilvl w:val="1"/>
+          <w:numId w:val="2"/>
+        </w:numPr>
+      </w:pPr>
+      <w:r>
+        <w:t>Sposób pomiaru: porównanie czasu pracy przed i po wdrożeniu</w:t>
+      </w:r>
+    </w:p>
+    <w:p>
+      <w:pPr>
+        <w:numPr>
+          <w:ilvl w:val="0"/>
+          <w:numId w:val="2"/>
+        </w:numPr>
+      </w:pPr>
+      <w:r>
+        <w:t xml:space="preserve">Trenerzy: zamiast 10 minut/trening na listę obecności → 2 minuty (klik w telefonie) </w:t>
+      </w:r>
+    </w:p>
+    <w:p>
+      <w:pPr>
+        <w:numPr>
+          <w:ilvl w:val="1"/>
+          <w:numId w:val="2"/>
+        </w:numPr>
+      </w:pPr>
+      <w:r>
+        <w:t>Sposób pomiaru: czas od startu treningu do zakończenia rejestracji</w:t>
+      </w:r>
+    </w:p>
+    <w:p>
+      <w:pPr>
+        <w:rPr>
+          <w:b/>
+          <w:bCs/>
+        </w:rPr>
+      </w:pPr>
+      <w:r>
+        <w:rPr>
+          <w:b/>
+          <w:bCs/>
+        </w:rPr>
+        <w:t>Lepsze płatności</w:t>
       </w:r>
     </w:p>
     <w:p>
@@ -623,14 +1095,18 @@
         </w:numPr>
       </w:pPr>
       <w:r>
-        <w:rPr>
-          <w:b/>
-          <w:bCs/>
-        </w:rPr>
-        <w:t>Moduł rejestracji i zarządzania zawodnikami</w:t>
-      </w:r>
-      <w:r>
-        <w:t xml:space="preserve"> – elektroniczna rejestracja dzieci przez rodziców, zarządzanie kartoteką zawodnika (dane osobowe, PESEL, dane opiekunów, kategoria wiekowa, pozycja na boisku)</w:t>
+        <w:t xml:space="preserve">Szybsze wpłaty: mniej zaległości dzięki automatycznym przypomnieniom </w:t>
+      </w:r>
+    </w:p>
+    <w:p>
+      <w:pPr>
+        <w:numPr>
+          <w:ilvl w:val="1"/>
+          <w:numId w:val="3"/>
+        </w:numPr>
+      </w:pPr>
+      <w:r>
+        <w:t xml:space="preserve">Sposób pomiaru: liczba przelewów po terminie </w:t>
       </w:r>
     </w:p>
     <w:p>
@@ -641,86 +1117,33 @@
         </w:numPr>
       </w:pPr>
       <w:r>
-        <w:rPr>
-          <w:b/>
-          <w:bCs/>
-        </w:rPr>
-        <w:t>Moduł płatności</w:t>
-      </w:r>
-      <w:r>
-        <w:t xml:space="preserve"> – zintegrowana bramka płatnicza umożliwiająca opłacanie wpisowego i składek członkowskich online</w:t>
+        <w:t xml:space="preserve">Więcej płatności na czas: obecnie część rodziców płaci z opóźnieniem </w:t>
       </w:r>
     </w:p>
     <w:p>
       <w:pPr>
         <w:numPr>
-          <w:ilvl w:val="0"/>
+          <w:ilvl w:val="1"/>
           <w:numId w:val="3"/>
         </w:numPr>
       </w:pPr>
       <w:r>
-        <w:rPr>
-          <w:b/>
-          <w:bCs/>
-        </w:rPr>
-        <w:t>Moduł harmonogramów i statystyk</w:t>
-      </w:r>
-      <w:r>
-        <w:t xml:space="preserve"> – podgląd planu treningów, statystyk meczowych zawodnika (bramki, kartki)</w:t>
-      </w:r>
-    </w:p>
-    <w:p>
-      <w:pPr>
-        <w:numPr>
-          <w:ilvl w:val="0"/>
-          <w:numId w:val="3"/>
-        </w:numPr>
-      </w:pPr>
-      <w:r>
-        <w:rPr>
-          <w:b/>
-          <w:bCs/>
-        </w:rPr>
-        <w:t>Moduł zarządzania badaniami lekarskimi</w:t>
-      </w:r>
-      <w:r>
-        <w:t xml:space="preserve"> – monitoring ważności obowiązkowych badań (odnawianych co 6 miesięcy)</w:t>
-      </w:r>
-    </w:p>
-    <w:p>
-      <w:pPr>
-        <w:numPr>
-          <w:ilvl w:val="0"/>
-          <w:numId w:val="3"/>
-        </w:numPr>
-      </w:pPr>
-      <w:r>
-        <w:rPr>
-          <w:b/>
-          <w:bCs/>
-        </w:rPr>
-        <w:t>Moduł zarządzania sprzętem</w:t>
-      </w:r>
-      <w:r>
-        <w:t xml:space="preserve"> – ewidencja wypożyczonego sprzętu sportowego i kontrola zwrotów</w:t>
-      </w:r>
-    </w:p>
-    <w:p>
-      <w:pPr>
-        <w:numPr>
-          <w:ilvl w:val="0"/>
-          <w:numId w:val="3"/>
-        </w:numPr>
-      </w:pPr>
-      <w:r>
-        <w:rPr>
-          <w:b/>
-          <w:bCs/>
-        </w:rPr>
-        <w:t>Moduł zarządzania składami meczowymi</w:t>
-      </w:r>
-      <w:r>
-        <w:t xml:space="preserve"> – tworzenie wydarzeń meczowych, selekcja zawodników, generowanie powiadomień dla rodziców</w:t>
+        <w:t>Sposób pomiaru: % płatności na czas</w:t>
+      </w:r>
+    </w:p>
+    <w:p>
+      <w:pPr>
+        <w:rPr>
+          <w:b/>
+          <w:bCs/>
+        </w:rPr>
+      </w:pPr>
+      <w:r>
+        <w:rPr>
+          <w:b/>
+          <w:bCs/>
+        </w:rPr>
+        <w:t>Mniej błędów</w:t>
       </w:r>
     </w:p>
     <w:p>
@@ -731,14 +1154,18 @@
         </w:numPr>
       </w:pPr>
       <w:r>
-        <w:rPr>
-          <w:b/>
-          <w:bCs/>
-        </w:rPr>
-        <w:t>Moduł ewidencji frekwencji</w:t>
-      </w:r>
-      <w:r>
-        <w:t xml:space="preserve"> – rejestracja obecności bezpośrednio z boiska w czasie rzeczywistym</w:t>
+        <w:t xml:space="preserve">Badania lekarskie: system przypomni 14 dni przed terminem, zablokuje trening po terminie </w:t>
+      </w:r>
+    </w:p>
+    <w:p>
+      <w:pPr>
+        <w:numPr>
+          <w:ilvl w:val="1"/>
+          <w:numId w:val="5"/>
+        </w:numPr>
+      </w:pPr>
+      <w:r>
+        <w:t>Sposób pomiaru: liczba przeterminowanych badań – cel: 0 przypadków</w:t>
       </w:r>
     </w:p>
     <w:p>
@@ -749,14 +1176,70 @@
         </w:numPr>
       </w:pPr>
       <w:r>
-        <w:rPr>
-          <w:b/>
-          <w:bCs/>
-        </w:rPr>
-        <w:t>Moduł komunikacji kryzysowej</w:t>
-      </w:r>
-      <w:r>
-        <w:t xml:space="preserve"> – zbiorcze powiadomienia SMS/e-mail o odwołaniu treningów</w:t>
+        <w:t xml:space="preserve">Zwrot sprzętu: automatyczne przypomnienia przy rezygnacji </w:t>
+      </w:r>
+    </w:p>
+    <w:p>
+      <w:pPr>
+        <w:numPr>
+          <w:ilvl w:val="1"/>
+          <w:numId w:val="5"/>
+        </w:numPr>
+      </w:pPr>
+      <w:r>
+        <w:t>Sposób pomiaru: wartość niezwróconego sprzętu – cel: redukcja strat o 80%</w:t>
+      </w:r>
+    </w:p>
+    <w:p>
+      <w:pPr>
+        <w:rPr>
+          <w:b/>
+          <w:bCs/>
+        </w:rPr>
+      </w:pPr>
+      <w:r>
+        <w:rPr>
+          <w:b/>
+          <w:bCs/>
+        </w:rPr>
+        <w:br w:type="page"/>
+      </w:r>
+    </w:p>
+    <w:p>
+      <w:pPr>
+        <w:rPr>
+          <w:b/>
+          <w:bCs/>
+        </w:rPr>
+      </w:pPr>
+      <w:r>
+        <w:rPr>
+          <w:b/>
+          <w:bCs/>
+        </w:rPr>
+        <w:t>2.3.2</w:t>
+      </w:r>
+      <w:r>
+        <w:rPr>
+          <w:b/>
+          <w:bCs/>
+        </w:rPr>
+        <w:t>. KORZYŚCI NIEMIERZALNE</w:t>
+      </w:r>
+    </w:p>
+    <w:p>
+      <w:pPr>
+        <w:rPr>
+          <w:b/>
+          <w:bCs/>
+        </w:rPr>
+      </w:pPr>
+      <w:r>
+        <w:rPr>
+          <w:b/>
+          <w:bCs/>
+        </w:rPr>
+        <w:t>Wygoda dla rodziców</w:t>
       </w:r>
     </w:p>
     <w:p>
@@ -767,554 +1250,209 @@
         </w:numPr>
       </w:pPr>
       <w:r>
-        <w:rPr>
-          <w:b/>
-          <w:bCs/>
-        </w:rPr>
-        <w:t xml:space="preserve">Moduł </w:t>
-      </w:r>
-      <w:proofErr w:type="spellStart"/>
-      <w:r>
-        <w:rPr>
-          <w:b/>
-          <w:bCs/>
-        </w:rPr>
-        <w:t>przypisań</w:t>
-      </w:r>
-      <w:proofErr w:type="spellEnd"/>
-      <w:r>
-        <w:t xml:space="preserve"> – zarządzanie przypisaniem trenerów do grup szkoleniowych i obiektów sportowych</w:t>
-      </w:r>
-    </w:p>
-    <w:p>
-      <w:pPr>
-        <w:rPr>
-          <w:b/>
-          <w:bCs/>
-        </w:rPr>
-      </w:pPr>
-      <w:r>
-        <w:rPr>
-          <w:b/>
-          <w:bCs/>
-        </w:rPr>
-        <w:br w:type="page"/>
-      </w:r>
-    </w:p>
-    <w:p>
-      <w:pPr>
-        <w:rPr>
-          <w:b/>
-          <w:bCs/>
-        </w:rPr>
-      </w:pPr>
-      <w:r>
-        <w:rPr>
-          <w:b/>
-          <w:bCs/>
-        </w:rPr>
-        <w:lastRenderedPageBreak/>
-        <w:t>2.2</w:t>
-      </w:r>
-      <w:r>
-        <w:rPr>
-          <w:b/>
-          <w:bCs/>
-        </w:rPr>
-        <w:t>. KONTEKST WDROŻENIA</w:t>
-      </w:r>
-    </w:p>
-    <w:p>
-      <w:r>
-        <w:t xml:space="preserve">Akademia Piłkarska "FC Drewno </w:t>
-      </w:r>
-      <w:proofErr w:type="spellStart"/>
-      <w:r>
-        <w:t>Academy</w:t>
-      </w:r>
-      <w:proofErr w:type="spellEnd"/>
-      <w:r>
-        <w:t>" prowadzi profesjonalne szkolenie dzieci i młodzieży od 2015 roku. Dynamiczny rozwój klubu i stale rosnąca liczba podopiecznych sprawiły, że dotychczasowy, oparty na papierze model zarządzania stał się niewydolny. Procesy takie jak ręczne zestawianie obecności z wyciągami bankowymi czy uciążliwe, telefoniczne upominanie rodziców o składki zaczęły generować straty czasu oraz opóźnienia w płatnościach</w:t>
-      </w:r>
-      <w:r>
-        <w:t>.</w:t>
-      </w:r>
-    </w:p>
-    <w:p>
-      <w:pPr>
-        <w:rPr>
-          <w:b/>
-          <w:bCs/>
-        </w:rPr>
-      </w:pPr>
-      <w:r>
-        <w:rPr>
-          <w:b/>
-          <w:bCs/>
-        </w:rPr>
-        <w:t>2.3</w:t>
-      </w:r>
-      <w:r>
-        <w:rPr>
-          <w:b/>
-          <w:bCs/>
-        </w:rPr>
-        <w:t>. PRZEWIDYWALNE KORZYŚCI Z WDROŻENIA</w:t>
-      </w:r>
-    </w:p>
-    <w:p>
-      <w:pPr>
-        <w:rPr>
-          <w:b/>
-          <w:bCs/>
-        </w:rPr>
-      </w:pPr>
-      <w:r>
-        <w:rPr>
-          <w:b/>
-          <w:bCs/>
-        </w:rPr>
-        <w:t>2.3</w:t>
-      </w:r>
-      <w:r>
-        <w:rPr>
-          <w:b/>
-          <w:bCs/>
-        </w:rPr>
-        <w:t>.1. KORZYŚCI MIERZALNE</w:t>
-      </w:r>
-    </w:p>
-    <w:p>
-      <w:r>
-        <w:t>Oszczędność czasu</w:t>
+        <w:t>Zapis dziecka o każdej porze, bez konieczności dzwonienia</w:t>
       </w:r>
     </w:p>
     <w:p>
       <w:pPr>
         <w:numPr>
           <w:ilvl w:val="0"/>
-          <w:numId w:val="1"/>
+          <w:numId w:val="5"/>
         </w:numPr>
       </w:pPr>
       <w:r>
-        <w:t xml:space="preserve">Administracja: zamiast 30 godzin/miesiąc na ręczne zestawianie list i płatności → 0 godzin (wszystko automatycznie) </w:t>
-      </w:r>
-    </w:p>
-    <w:p>
-      <w:pPr>
-        <w:numPr>
-          <w:ilvl w:val="1"/>
-          <w:numId w:val="1"/>
-        </w:numPr>
-      </w:pPr>
-      <w:r>
-        <w:t>Sposób pomiaru: porównanie czasu pracy przed i po wdrożeniu</w:t>
+        <w:t>Dostęp do informacji 24/7 (statystyki, harmonogram, płatności)</w:t>
       </w:r>
     </w:p>
     <w:p>
       <w:pPr>
         <w:numPr>
           <w:ilvl w:val="0"/>
-          <w:numId w:val="1"/>
+          <w:numId w:val="5"/>
         </w:numPr>
       </w:pPr>
       <w:r>
-        <w:t xml:space="preserve">Trenerzy: zamiast 10 minut/trening na listę obecności → 2 minuty (klik w telefonie) </w:t>
-      </w:r>
-    </w:p>
-    <w:p>
-      <w:pPr>
-        <w:numPr>
-          <w:ilvl w:val="1"/>
-          <w:numId w:val="1"/>
-        </w:numPr>
-      </w:pPr>
-      <w:r>
-        <w:t>Sposób pomiaru: czas od startu treningu do zakończenia rejestracji</w:t>
-      </w:r>
-    </w:p>
-    <w:p>
-      <w:pPr>
-        <w:rPr>
-          <w:b/>
-          <w:bCs/>
-        </w:rPr>
-      </w:pPr>
-      <w:r>
-        <w:rPr>
-          <w:b/>
-          <w:bCs/>
-        </w:rPr>
-        <w:t>Lepsze płatności</w:t>
+        <w:t>Natychmiastowe powiadomienia (odwołanie, powołanie na mecz)</w:t>
+      </w:r>
+    </w:p>
+    <w:p>
+      <w:pPr>
+        <w:rPr>
+          <w:b/>
+          <w:bCs/>
+        </w:rPr>
+      </w:pPr>
+      <w:r>
+        <w:rPr>
+          <w:b/>
+          <w:bCs/>
+        </w:rPr>
+        <w:t>Lepszy wizerunek</w:t>
       </w:r>
     </w:p>
     <w:p>
       <w:pPr>
         <w:numPr>
           <w:ilvl w:val="0"/>
-          <w:numId w:val="2"/>
+          <w:numId w:val="5"/>
         </w:numPr>
       </w:pPr>
       <w:r>
-        <w:t xml:space="preserve">Szybsze wpłaty: mniej zaległości dzięki automatycznym przypomnieniom </w:t>
-      </w:r>
-    </w:p>
-    <w:p>
-      <w:pPr>
-        <w:numPr>
-          <w:ilvl w:val="1"/>
-          <w:numId w:val="2"/>
-        </w:numPr>
-      </w:pPr>
-      <w:r>
-        <w:t xml:space="preserve">Sposób pomiaru: liczba przelewów po terminie </w:t>
+        <w:t>Akademia wygląda nowocześnie i profesjonalnie</w:t>
       </w:r>
     </w:p>
     <w:p>
       <w:pPr>
         <w:numPr>
           <w:ilvl w:val="0"/>
-          <w:numId w:val="2"/>
+          <w:numId w:val="5"/>
         </w:numPr>
       </w:pPr>
       <w:r>
-        <w:t xml:space="preserve">Więcej płatności na czas: obecnie część rodziców płaci z opóźnieniem </w:t>
-      </w:r>
-    </w:p>
-    <w:p>
-      <w:pPr>
-        <w:numPr>
-          <w:ilvl w:val="1"/>
-          <w:numId w:val="2"/>
-        </w:numPr>
-      </w:pPr>
-      <w:r>
-        <w:t>Sposób pomiaru: % płatności na czas</w:t>
-      </w:r>
-    </w:p>
-    <w:p>
-      <w:pPr>
-        <w:rPr>
-          <w:b/>
-          <w:bCs/>
-        </w:rPr>
-      </w:pPr>
-      <w:r>
-        <w:rPr>
-          <w:b/>
-          <w:bCs/>
-        </w:rPr>
-        <w:t>Mniej błędów</w:t>
+        <w:t>Większe zaufanie rodziców</w:t>
       </w:r>
     </w:p>
     <w:p>
       <w:pPr>
         <w:numPr>
           <w:ilvl w:val="0"/>
-          <w:numId w:val="4"/>
+          <w:numId w:val="5"/>
         </w:numPr>
       </w:pPr>
       <w:r>
-        <w:t xml:space="preserve">Badania lekarskie: system przypomni 14 dni przed terminem, zablokuje trening po terminie </w:t>
-      </w:r>
-    </w:p>
-    <w:p>
-      <w:pPr>
-        <w:numPr>
-          <w:ilvl w:val="1"/>
-          <w:numId w:val="4"/>
-        </w:numPr>
-      </w:pPr>
-      <w:r>
-        <w:t>Sposób pomiaru: liczba przeterminowanych badań – cel: 0 przypadków</w:t>
+        <w:t>Wzmocnienie pozycji lidera w regionie</w:t>
+      </w:r>
+    </w:p>
+    <w:p>
+      <w:pPr>
+        <w:rPr>
+          <w:b/>
+          <w:bCs/>
+        </w:rPr>
+      </w:pPr>
+      <w:r>
+        <w:rPr>
+          <w:b/>
+          <w:bCs/>
+        </w:rPr>
+        <w:t>Łatwiejsze zarządzanie</w:t>
       </w:r>
     </w:p>
     <w:p>
       <w:pPr>
         <w:numPr>
           <w:ilvl w:val="0"/>
-          <w:numId w:val="4"/>
+          <w:numId w:val="5"/>
         </w:numPr>
       </w:pPr>
       <w:r>
-        <w:t xml:space="preserve">Zwrot sprzętu: automatyczne przypomnienia przy rezygnacji </w:t>
-      </w:r>
-    </w:p>
-    <w:p>
-      <w:pPr>
-        <w:numPr>
-          <w:ilvl w:val="1"/>
-          <w:numId w:val="4"/>
-        </w:numPr>
-      </w:pPr>
-      <w:r>
-        <w:t>Sposób pomiaru: wartość niezwróconego sprzętu – cel: redukcja strat o 80%</w:t>
-      </w:r>
-    </w:p>
-    <w:p>
-      <w:pPr>
-        <w:rPr>
-          <w:b/>
-          <w:bCs/>
-        </w:rPr>
-      </w:pPr>
-      <w:r>
-        <w:rPr>
-          <w:b/>
-          <w:bCs/>
-        </w:rPr>
-        <w:br w:type="page"/>
-      </w:r>
-    </w:p>
-    <w:p>
-      <w:pPr>
-        <w:rPr>
-          <w:b/>
-          <w:bCs/>
-        </w:rPr>
-      </w:pPr>
-      <w:r>
-        <w:rPr>
-          <w:b/>
-          <w:bCs/>
-        </w:rPr>
-        <w:lastRenderedPageBreak/>
-        <w:t>2.3.2</w:t>
-      </w:r>
-      <w:r>
-        <w:rPr>
-          <w:b/>
-          <w:bCs/>
-        </w:rPr>
-        <w:t>. KORZYŚCI NIEMIERZALNE</w:t>
-      </w:r>
-    </w:p>
-    <w:p>
-      <w:pPr>
-        <w:rPr>
-          <w:b/>
-          <w:bCs/>
-        </w:rPr>
-      </w:pPr>
-      <w:r>
-        <w:rPr>
-          <w:b/>
-          <w:bCs/>
-        </w:rPr>
-        <w:t>Wygoda dla rodziców</w:t>
+        <w:t>Zarząd ma dostęp do statystyk i raportów</w:t>
       </w:r>
     </w:p>
     <w:p>
       <w:pPr>
         <w:numPr>
           <w:ilvl w:val="0"/>
-          <w:numId w:val="4"/>
+          <w:numId w:val="5"/>
         </w:numPr>
       </w:pPr>
       <w:r>
-        <w:t>Zapis dziecka o każdej porze, bez konieczności dzwonienia</w:t>
+        <w:t>Łatwiej podejmować decyzje na podstawie danych</w:t>
       </w:r>
     </w:p>
     <w:p>
       <w:pPr>
         <w:numPr>
           <w:ilvl w:val="0"/>
-          <w:numId w:val="4"/>
+          <w:numId w:val="5"/>
         </w:numPr>
       </w:pPr>
       <w:r>
-        <w:t>Dostęp do informacji 24/7 (statystyki, harmonogram, płatności)</w:t>
+        <w:t>Widać trendy (frekwencja, rezygnacje, wyniki)</w:t>
+      </w:r>
+    </w:p>
+    <w:p>
+      <w:pPr>
+        <w:rPr>
+          <w:b/>
+          <w:bCs/>
+        </w:rPr>
+      </w:pPr>
+      <w:r>
+        <w:rPr>
+          <w:b/>
+          <w:bCs/>
+        </w:rPr>
+        <w:t>Lepsza praca trenerów</w:t>
       </w:r>
     </w:p>
     <w:p>
       <w:pPr>
         <w:numPr>
           <w:ilvl w:val="0"/>
-          <w:numId w:val="4"/>
+          <w:numId w:val="5"/>
         </w:numPr>
       </w:pPr>
       <w:r>
-        <w:t>Natychmiastowe powiadomienia (odwołanie, powołanie na mecz)</w:t>
-      </w:r>
-    </w:p>
-    <w:p>
-      <w:pPr>
-        <w:rPr>
-          <w:b/>
-          <w:bCs/>
-        </w:rPr>
-      </w:pPr>
-      <w:r>
-        <w:rPr>
-          <w:b/>
-          <w:bCs/>
-        </w:rPr>
-        <w:t>Lepszy wizerunek</w:t>
+        <w:t>Mniej papierkowej roboty, więcej czasu na trening</w:t>
       </w:r>
     </w:p>
     <w:p>
       <w:pPr>
         <w:numPr>
           <w:ilvl w:val="0"/>
-          <w:numId w:val="4"/>
+          <w:numId w:val="5"/>
         </w:numPr>
       </w:pPr>
       <w:r>
-        <w:t>Akademia wygląda nowocześnie i profesjonalnie</w:t>
+        <w:t>Łatwy dostęp do profili zawodników przy wyborze składu</w:t>
+      </w:r>
+    </w:p>
+    <w:p>
+      <w:pPr>
+        <w:rPr>
+          <w:b/>
+          <w:bCs/>
+        </w:rPr>
+      </w:pPr>
+      <w:r>
+        <w:rPr>
+          <w:b/>
+          <w:bCs/>
+        </w:rPr>
+        <w:t>Możliwość rozwoju</w:t>
       </w:r>
     </w:p>
     <w:p>
       <w:pPr>
         <w:numPr>
           <w:ilvl w:val="0"/>
-          <w:numId w:val="4"/>
+          <w:numId w:val="5"/>
         </w:numPr>
       </w:pPr>
       <w:r>
-        <w:t>Większe zaufanie rodziców</w:t>
+        <w:t>Łatwiej przyjąć więcej zawodników bez zwiększania administracji</w:t>
       </w:r>
     </w:p>
     <w:p>
       <w:pPr>
         <w:numPr>
           <w:ilvl w:val="0"/>
-          <w:numId w:val="4"/>
+          <w:numId w:val="5"/>
         </w:numPr>
       </w:pPr>
       <w:r>
-        <w:t>Wzmocnienie pozycji lidera w regionie</w:t>
-      </w:r>
-    </w:p>
-    <w:p>
-      <w:pPr>
-        <w:rPr>
-          <w:b/>
-          <w:bCs/>
-        </w:rPr>
-      </w:pPr>
-      <w:r>
-        <w:rPr>
-          <w:b/>
-          <w:bCs/>
-        </w:rPr>
-        <w:t>Łatwiejsze zarządzanie</w:t>
+        <w:t>Gotowość do otwierania nowych oddziałów</w:t>
       </w:r>
     </w:p>
     <w:p>
       <w:pPr>
         <w:numPr>
           <w:ilvl w:val="0"/>
-          <w:numId w:val="4"/>
+          <w:numId w:val="5"/>
         </w:numPr>
       </w:pPr>
       <w:r>
-        <w:t>Zarząd ma dostęp do statystyk i raportów</w:t>
-      </w:r>
-    </w:p>
-    <w:p>
-      <w:pPr>
-        <w:numPr>
-          <w:ilvl w:val="0"/>
-          <w:numId w:val="4"/>
-        </w:numPr>
-      </w:pPr>
-      <w:r>
-        <w:t>Łatwiej podejmować decyzje na podstawie danych</w:t>
-      </w:r>
-    </w:p>
-    <w:p>
-      <w:pPr>
-        <w:numPr>
-          <w:ilvl w:val="0"/>
-          <w:numId w:val="4"/>
-        </w:numPr>
-      </w:pPr>
-      <w:r>
-        <w:t>Widać trendy (frekwencja, rezygnacje, wyniki)</w:t>
-      </w:r>
-    </w:p>
-    <w:p>
-      <w:pPr>
-        <w:rPr>
-          <w:b/>
-          <w:bCs/>
-        </w:rPr>
-      </w:pPr>
-      <w:r>
-        <w:rPr>
-          <w:b/>
-          <w:bCs/>
-        </w:rPr>
-        <w:t>Lepsza praca trenerów</w:t>
-      </w:r>
-    </w:p>
-    <w:p>
-      <w:pPr>
-        <w:numPr>
-          <w:ilvl w:val="0"/>
-          <w:numId w:val="4"/>
-        </w:numPr>
-      </w:pPr>
-      <w:r>
-        <w:t>Mniej papierkowej roboty, więcej czasu na trening</w:t>
-      </w:r>
-    </w:p>
-    <w:p>
-      <w:pPr>
-        <w:numPr>
-          <w:ilvl w:val="0"/>
-          <w:numId w:val="4"/>
-        </w:numPr>
-      </w:pPr>
-      <w:r>
-        <w:t>Łatwy dostęp do profili zawodników przy wyborze składu</w:t>
-      </w:r>
-    </w:p>
-    <w:p>
-      <w:pPr>
-        <w:rPr>
-          <w:b/>
-          <w:bCs/>
-        </w:rPr>
-      </w:pPr>
-      <w:r>
-        <w:rPr>
-          <w:b/>
-          <w:bCs/>
-        </w:rPr>
-        <w:t>Możliwość rozwoju</w:t>
-      </w:r>
-    </w:p>
-    <w:p>
-      <w:pPr>
-        <w:numPr>
-          <w:ilvl w:val="0"/>
-          <w:numId w:val="4"/>
-        </w:numPr>
-      </w:pPr>
-      <w:r>
-        <w:t>Łatwiej przyjąć więcej zawodników bez zwiększania administracji</w:t>
-      </w:r>
-    </w:p>
-    <w:p>
-      <w:pPr>
-        <w:numPr>
-          <w:ilvl w:val="0"/>
-          <w:numId w:val="4"/>
-        </w:numPr>
-      </w:pPr>
-      <w:r>
-        <w:t>Gotowość do otwierania nowych oddziałów</w:t>
-      </w:r>
-    </w:p>
-    <w:p>
-      <w:pPr>
-        <w:numPr>
-          <w:ilvl w:val="0"/>
-          <w:numId w:val="4"/>
-        </w:numPr>
-      </w:pPr>
-      <w:r>
         <w:t>Wszystkie procesy ustandaryzowane</w:t>
       </w:r>
     </w:p>
@@ -1335,7 +1473,6 @@
           <w:b/>
           <w:bCs/>
         </w:rPr>
-        <w:lastRenderedPageBreak/>
         <w:t>5.4</w:t>
       </w:r>
       <w:r>
@@ -1578,7 +1715,6 @@
           <w:b/>
           <w:bCs/>
         </w:rPr>
-        <w:lastRenderedPageBreak/>
         <w:t>2. Panel Opiekuna</w:t>
       </w:r>
     </w:p>
@@ -1843,7 +1979,6 @@
           <w:b/>
           <w:bCs/>
         </w:rPr>
-        <w:lastRenderedPageBreak/>
         <w:t>3. Panel Trenera</w:t>
       </w:r>
     </w:p>
@@ -1941,9 +2076,8 @@
           <w:szCs w:val="18"/>
           <w:lang w:val="en-GB"/>
         </w:rPr>
-        <w:t xml:space="preserve">Rys. 5 </w:t>
-      </w:r>
-      <w:proofErr w:type="spellStart"/>
+        <w:t xml:space="preserve">Rys. 5 wersja </w:t>
+      </w:r>
       <w:r>
         <w:rPr>
           <w:i/>
@@ -1952,9 +2086,8 @@
           <w:szCs w:val="18"/>
           <w:lang w:val="en-GB"/>
         </w:rPr>
-        <w:t>wersja</w:t>
-      </w:r>
-      <w:proofErr w:type="spellEnd"/>
+        <w:t>desktopowa</w:t>
+      </w:r>
       <w:r>
         <w:rPr>
           <w:i/>
@@ -1963,9 +2096,8 @@
           <w:szCs w:val="18"/>
           <w:lang w:val="en-GB"/>
         </w:rPr>
-        <w:t xml:space="preserve"> </w:t>
-      </w:r>
-      <w:proofErr w:type="spellStart"/>
+        <w:t xml:space="preserve"> panel tre</w:t>
+      </w:r>
       <w:r>
         <w:rPr>
           <w:i/>
@@ -1974,41 +2106,8 @@
           <w:szCs w:val="18"/>
           <w:lang w:val="en-GB"/>
         </w:rPr>
-        <w:t>desktopowa</w:t>
-      </w:r>
-      <w:proofErr w:type="spellEnd"/>
-      <w:r>
-        <w:rPr>
-          <w:i/>
-          <w:iCs/>
-          <w:sz w:val="18"/>
-          <w:szCs w:val="18"/>
-          <w:lang w:val="en-GB"/>
-        </w:rPr>
-        <w:t xml:space="preserve"> panel </w:t>
-      </w:r>
-      <w:proofErr w:type="spellStart"/>
-      <w:r>
-        <w:rPr>
-          <w:i/>
-          <w:iCs/>
-          <w:sz w:val="18"/>
-          <w:szCs w:val="18"/>
-          <w:lang w:val="en-GB"/>
-        </w:rPr>
-        <w:t>tre</w:t>
-      </w:r>
-      <w:r>
-        <w:rPr>
-          <w:i/>
-          <w:iCs/>
-          <w:sz w:val="18"/>
-          <w:szCs w:val="18"/>
-          <w:lang w:val="en-GB"/>
-        </w:rPr>
         <w:t>nera</w:t>
       </w:r>
-      <w:proofErr w:type="spellEnd"/>
     </w:p>
     <w:p>
       <w:pPr>
@@ -2117,7 +2216,6 @@
           <w:b/>
           <w:bCs/>
         </w:rPr>
-        <w:lastRenderedPageBreak/>
         <w:t>4</w:t>
       </w:r>
       <w:r>
@@ -2344,69 +2442,19 @@
         <w:rPr>
           <w:rFonts w:eastAsiaTheme="minorEastAsia"/>
         </w:rPr>
-        <w:t xml:space="preserve">Do wykonania prototypów </w:t>
-      </w:r>
-      <w:proofErr w:type="spellStart"/>
+        <w:t xml:space="preserve">Do wykonania prototypów intetrfejsów użyto GenAI </w:t>
+      </w:r>
       <w:r>
         <w:rPr>
           <w:rFonts w:eastAsiaTheme="minorEastAsia"/>
         </w:rPr>
-        <w:t>intetrfejsów</w:t>
-      </w:r>
-      <w:proofErr w:type="spellEnd"/>
+        <w:t>(</w:t>
+      </w:r>
       <w:r>
         <w:rPr>
           <w:rFonts w:eastAsiaTheme="minorEastAsia"/>
         </w:rPr>
-        <w:t xml:space="preserve"> użyto </w:t>
-      </w:r>
-      <w:proofErr w:type="spellStart"/>
-      <w:r>
-        <w:rPr>
-          <w:rFonts w:eastAsiaTheme="minorEastAsia"/>
-        </w:rPr>
-        <w:t>GenAI</w:t>
-      </w:r>
-      <w:proofErr w:type="spellEnd"/>
-      <w:r>
-        <w:rPr>
-          <w:rFonts w:eastAsiaTheme="minorEastAsia"/>
-        </w:rPr>
-        <w:t xml:space="preserve"> </w:t>
-      </w:r>
-      <w:r>
-        <w:rPr>
-          <w:rFonts w:eastAsiaTheme="minorEastAsia"/>
-        </w:rPr>
-        <w:t>(</w:t>
-      </w:r>
-      <w:proofErr w:type="spellStart"/>
-      <w:r>
-        <w:rPr>
-          <w:rFonts w:eastAsiaTheme="minorEastAsia"/>
-        </w:rPr>
-        <w:t>gpt</w:t>
-      </w:r>
-      <w:proofErr w:type="spellEnd"/>
-      <w:r>
-        <w:rPr>
-          <w:rFonts w:eastAsiaTheme="minorEastAsia"/>
-        </w:rPr>
-        <w:t xml:space="preserve"> 5.3 </w:t>
-      </w:r>
-      <w:proofErr w:type="spellStart"/>
-      <w:r>
-        <w:rPr>
-          <w:rFonts w:eastAsiaTheme="minorEastAsia"/>
-        </w:rPr>
-        <w:t>codex</w:t>
-      </w:r>
-      <w:proofErr w:type="spellEnd"/>
-      <w:r>
-        <w:rPr>
-          <w:rFonts w:eastAsiaTheme="minorEastAsia"/>
-        </w:rPr>
-        <w:t>)</w:t>
+        <w:t>gpt 5.3 codex)</w:t>
       </w:r>
     </w:p>
     <w:sectPr>
@@ -3067,6 +3115,92 @@
     </w:lvl>
   </w:abstractNum>
   <w:abstractNum w:abstractNumId="5" w15:restartNumberingAfterBreak="0">
+    <w:nsid w:val="6205753F"/>
+    <w:multiLevelType w:val="hybridMultilevel"/>
+    <w:tmpl w:val="FFFFFFFF"/>
+    <w:lvl w:ilvl="0" w:tplc="EB664464">
+      <w:start w:val="1"/>
+      <w:numFmt w:val="decimal"/>
+      <w:lvlText w:val="%1."/>
+      <w:lvlJc w:val="left"/>
+      <w:pPr>
+        <w:ind w:left="720" w:hanging="360"/>
+      </w:pPr>
+    </w:lvl>
+    <w:lvl w:ilvl="1" w:tplc="02F6D4E0">
+      <w:start w:val="1"/>
+      <w:numFmt w:val="lowerLetter"/>
+      <w:lvlText w:val="%2."/>
+      <w:lvlJc w:val="left"/>
+      <w:pPr>
+        <w:ind w:left="1440" w:hanging="360"/>
+      </w:pPr>
+    </w:lvl>
+    <w:lvl w:ilvl="2" w:tplc="20BA0842">
+      <w:start w:val="1"/>
+      <w:numFmt w:val="lowerRoman"/>
+      <w:lvlText w:val="%3."/>
+      <w:lvlJc w:val="right"/>
+      <w:pPr>
+        <w:ind w:left="2160" w:hanging="180"/>
+      </w:pPr>
+    </w:lvl>
+    <w:lvl w:ilvl="3" w:tplc="279603B0">
+      <w:start w:val="1"/>
+      <w:numFmt w:val="decimal"/>
+      <w:lvlText w:val="%4."/>
+      <w:lvlJc w:val="left"/>
+      <w:pPr>
+        <w:ind w:left="2880" w:hanging="360"/>
+      </w:pPr>
+    </w:lvl>
+    <w:lvl w:ilvl="4" w:tplc="B35A395C">
+      <w:start w:val="1"/>
+      <w:numFmt w:val="lowerLetter"/>
+      <w:lvlText w:val="%5."/>
+      <w:lvlJc w:val="left"/>
+      <w:pPr>
+        <w:ind w:left="3600" w:hanging="360"/>
+      </w:pPr>
+    </w:lvl>
+    <w:lvl w:ilvl="5" w:tplc="EF227482">
+      <w:start w:val="1"/>
+      <w:numFmt w:val="lowerRoman"/>
+      <w:lvlText w:val="%6."/>
+      <w:lvlJc w:val="right"/>
+      <w:pPr>
+        <w:ind w:left="4320" w:hanging="180"/>
+      </w:pPr>
+    </w:lvl>
+    <w:lvl w:ilvl="6" w:tplc="3B2C8172">
+      <w:start w:val="1"/>
+      <w:numFmt w:val="decimal"/>
+      <w:lvlText w:val="%7."/>
+      <w:lvlJc w:val="left"/>
+      <w:pPr>
+        <w:ind w:left="5040" w:hanging="360"/>
+      </w:pPr>
+    </w:lvl>
+    <w:lvl w:ilvl="7" w:tplc="9B988142">
+      <w:start w:val="1"/>
+      <w:numFmt w:val="lowerLetter"/>
+      <w:lvlText w:val="%8."/>
+      <w:lvlJc w:val="left"/>
+      <w:pPr>
+        <w:ind w:left="5760" w:hanging="360"/>
+      </w:pPr>
+    </w:lvl>
+    <w:lvl w:ilvl="8" w:tplc="3174A4F0">
+      <w:start w:val="1"/>
+      <w:numFmt w:val="lowerRoman"/>
+      <w:lvlText w:val="%9."/>
+      <w:lvlJc w:val="right"/>
+      <w:pPr>
+        <w:ind w:left="6480" w:hanging="180"/>
+      </w:pPr>
+    </w:lvl>
+  </w:abstractNum>
+  <w:abstractNum w:abstractNumId="6" w15:restartNumberingAfterBreak="0">
     <w:nsid w:val="70CB58DE"/>
     <w:multiLevelType w:val="multilevel"/>
     <w:tmpl w:val="F4342630"/>
@@ -3215,7 +3349,7 @@
       </w:rPr>
     </w:lvl>
   </w:abstractNum>
-  <w:abstractNum w:abstractNumId="6" w15:restartNumberingAfterBreak="0">
+  <w:abstractNum w:abstractNumId="7" w15:restartNumberingAfterBreak="0">
     <w:nsid w:val="7F6F2235"/>
     <w:multiLevelType w:val="multilevel"/>
     <w:tmpl w:val="1626335E"/>
@@ -3364,25 +3498,28 @@
       </w:rPr>
     </w:lvl>
   </w:abstractNum>
-  <w:num w:numId="1" w16cid:durableId="1122646896">
+  <w:num w:numId="1" w16cid:durableId="408621779">
+    <w:abstractNumId w:val="5"/>
+  </w:num>
+  <w:num w:numId="2" w16cid:durableId="1122646896">
     <w:abstractNumId w:val="0"/>
   </w:num>
-  <w:num w:numId="2" w16cid:durableId="1167131792">
-    <w:abstractNumId w:val="5"/>
-  </w:num>
-  <w:num w:numId="3" w16cid:durableId="156458087">
+  <w:num w:numId="3" w16cid:durableId="1167131792">
     <w:abstractNumId w:val="6"/>
   </w:num>
-  <w:num w:numId="4" w16cid:durableId="1893615600">
+  <w:num w:numId="4" w16cid:durableId="156458087">
+    <w:abstractNumId w:val="7"/>
+  </w:num>
+  <w:num w:numId="5" w16cid:durableId="1893615600">
     <w:abstractNumId w:val="3"/>
   </w:num>
-  <w:num w:numId="5" w16cid:durableId="667027180">
+  <w:num w:numId="6" w16cid:durableId="667027180">
     <w:abstractNumId w:val="1"/>
   </w:num>
-  <w:num w:numId="6" w16cid:durableId="841243481">
+  <w:num w:numId="7" w16cid:durableId="841243481">
     <w:abstractNumId w:val="2"/>
   </w:num>
-  <w:num w:numId="7" w16cid:durableId="1147746715">
+  <w:num w:numId="8" w16cid:durableId="1147746715">
     <w:abstractNumId w:val="4"/>
   </w:num>
   <w:numIdMacAtCleanup w:val="5"/>
@@ -3786,15 +3923,15 @@
     <w:lsdException w:name="Unresolved Mention" w:semiHidden="1" w:unhideWhenUsed="1"/>
     <w:lsdException w:name="Smart Link" w:semiHidden="1" w:unhideWhenUsed="1"/>
   </w:latentStyles>
-  <w:style w:type="paragraph" w:default="1" w:styleId="Normalny">
+  <w:style w:type="paragraph" w:default="1" w:styleId="Normal">
     <w:name w:val="Normal"/>
     <w:qFormat/>
   </w:style>
-  <w:style w:type="paragraph" w:styleId="Nagwek1">
+  <w:style w:type="paragraph" w:styleId="Heading1">
     <w:name w:val="heading 1"/>
-    <w:basedOn w:val="Normalny"/>
-    <w:next w:val="Normalny"/>
-    <w:link w:val="Nagwek1Znak"/>
+    <w:basedOn w:val="Normal"/>
+    <w:next w:val="Normal"/>
+    <w:link w:val="Heading1Char"/>
     <w:uiPriority w:val="9"/>
     <w:qFormat/>
     <w:rsid w:val="5C0D0B26"/>
@@ -3807,10 +3944,10 @@
       <w:szCs w:val="40"/>
     </w:rPr>
   </w:style>
-  <w:style w:type="paragraph" w:styleId="Nagwek2">
+  <w:style w:type="paragraph" w:styleId="Heading2">
     <w:name w:val="heading 2"/>
-    <w:basedOn w:val="Normalny"/>
-    <w:next w:val="Normalny"/>
+    <w:basedOn w:val="Normal"/>
+    <w:next w:val="Normal"/>
     <w:uiPriority w:val="9"/>
     <w:semiHidden/>
     <w:unhideWhenUsed/>
@@ -3825,10 +3962,10 @@
       <w:szCs w:val="32"/>
     </w:rPr>
   </w:style>
-  <w:style w:type="paragraph" w:styleId="Nagwek3">
+  <w:style w:type="paragraph" w:styleId="Heading3">
     <w:name w:val="heading 3"/>
-    <w:basedOn w:val="Normalny"/>
-    <w:next w:val="Normalny"/>
+    <w:basedOn w:val="Normal"/>
+    <w:next w:val="Normal"/>
     <w:uiPriority w:val="9"/>
     <w:semiHidden/>
     <w:unhideWhenUsed/>
@@ -3847,10 +3984,10 @@
       <w:szCs w:val="28"/>
     </w:rPr>
   </w:style>
-  <w:style w:type="paragraph" w:styleId="Nagwek4">
+  <w:style w:type="paragraph" w:styleId="Heading4">
     <w:name w:val="heading 4"/>
-    <w:basedOn w:val="Normalny"/>
-    <w:next w:val="Normalny"/>
+    <w:basedOn w:val="Normal"/>
+    <w:next w:val="Normal"/>
     <w:uiPriority w:val="9"/>
     <w:semiHidden/>
     <w:unhideWhenUsed/>
@@ -3869,10 +4006,10 @@
       <w:color w:val="0F4761" w:themeColor="accent1" w:themeShade="BF"/>
     </w:rPr>
   </w:style>
-  <w:style w:type="paragraph" w:styleId="Nagwek5">
+  <w:style w:type="paragraph" w:styleId="Heading5">
     <w:name w:val="heading 5"/>
-    <w:basedOn w:val="Normalny"/>
-    <w:next w:val="Normalny"/>
+    <w:basedOn w:val="Normal"/>
+    <w:next w:val="Normal"/>
     <w:uiPriority w:val="9"/>
     <w:semiHidden/>
     <w:unhideWhenUsed/>
@@ -3889,10 +4026,10 @@
       <w:color w:val="0F4761" w:themeColor="accent1" w:themeShade="BF"/>
     </w:rPr>
   </w:style>
-  <w:style w:type="paragraph" w:styleId="Nagwek6">
+  <w:style w:type="paragraph" w:styleId="Heading6">
     <w:name w:val="heading 6"/>
-    <w:basedOn w:val="Normalny"/>
-    <w:next w:val="Normalny"/>
+    <w:basedOn w:val="Normal"/>
+    <w:next w:val="Normal"/>
     <w:uiPriority w:val="9"/>
     <w:semiHidden/>
     <w:unhideWhenUsed/>
@@ -3911,10 +4048,10 @@
       <w:color w:val="595959" w:themeColor="text1" w:themeTint="A6"/>
     </w:rPr>
   </w:style>
-  <w:style w:type="paragraph" w:styleId="Nagwek7">
+  <w:style w:type="paragraph" w:styleId="Heading7">
     <w:name w:val="heading 7"/>
-    <w:basedOn w:val="Normalny"/>
-    <w:next w:val="Normalny"/>
+    <w:basedOn w:val="Normal"/>
+    <w:next w:val="Normal"/>
     <w:uiPriority w:val="9"/>
     <w:semiHidden/>
     <w:unhideWhenUsed/>
@@ -3931,10 +4068,10 @@
       <w:color w:val="595959" w:themeColor="text1" w:themeTint="A6"/>
     </w:rPr>
   </w:style>
-  <w:style w:type="paragraph" w:styleId="Nagwek8">
+  <w:style w:type="paragraph" w:styleId="Heading8">
     <w:name w:val="heading 8"/>
-    <w:basedOn w:val="Normalny"/>
-    <w:next w:val="Normalny"/>
+    <w:basedOn w:val="Normal"/>
+    <w:next w:val="Normal"/>
     <w:uiPriority w:val="9"/>
     <w:semiHidden/>
     <w:unhideWhenUsed/>
@@ -3953,10 +4090,10 @@
       <w:color w:val="272727" w:themeColor="text1" w:themeTint="D8"/>
     </w:rPr>
   </w:style>
-  <w:style w:type="paragraph" w:styleId="Nagwek9">
+  <w:style w:type="paragraph" w:styleId="Heading9">
     <w:name w:val="heading 9"/>
-    <w:basedOn w:val="Normalny"/>
-    <w:next w:val="Normalny"/>
+    <w:basedOn w:val="Normal"/>
+    <w:next w:val="Normal"/>
     <w:uiPriority w:val="9"/>
     <w:semiHidden/>
     <w:unhideWhenUsed/>
@@ -3973,13 +4110,13 @@
       <w:color w:val="272727" w:themeColor="text1" w:themeTint="D8"/>
     </w:rPr>
   </w:style>
-  <w:style w:type="character" w:default="1" w:styleId="Domylnaczcionkaakapitu">
+  <w:style w:type="character" w:default="1" w:styleId="DefaultParagraphFont">
     <w:name w:val="Default Paragraph Font"/>
     <w:uiPriority w:val="1"/>
     <w:semiHidden/>
     <w:unhideWhenUsed/>
   </w:style>
-  <w:style w:type="table" w:default="1" w:styleId="Standardowy">
+  <w:style w:type="table" w:default="1" w:styleId="TableNormal">
     <w:name w:val="Normal Table"/>
     <w:uiPriority w:val="99"/>
     <w:semiHidden/>
@@ -3994,30 +4131,27 @@
       </w:tblCellMar>
     </w:tblPr>
   </w:style>
-  <w:style w:type="numbering" w:default="1" w:styleId="Bezlisty">
+  <w:style w:type="numbering" w:default="1" w:styleId="NoList">
     <w:name w:val="No List"/>
     <w:uiPriority w:val="99"/>
     <w:semiHidden/>
     <w:unhideWhenUsed/>
   </w:style>
-  <w:style w:type="table" w:customStyle="1" w:styleId="TableNormal">
-    <w:name w:val="Table Normal"/>
-    <w:uiPriority w:val="99"/>
-    <w:semiHidden/>
-    <w:unhideWhenUsed/>
-    <w:tblPr>
-      <w:tblInd w:w="0" w:type="dxa"/>
-      <w:tblCellMar>
-        <w:top w:w="0" w:type="dxa"/>
-        <w:left w:w="108" w:type="dxa"/>
-        <w:bottom w:w="0" w:type="dxa"/>
-        <w:right w:w="108" w:type="dxa"/>
-      </w:tblCellMar>
-    </w:tblPr>
+  <w:style w:type="character" w:customStyle="1" w:styleId="Heading1Char">
+    <w:name w:val="Heading 1 Char"/>
+    <w:basedOn w:val="DefaultParagraphFont"/>
+    <w:link w:val="Heading1"/>
+    <w:uiPriority w:val="9"/>
+    <w:rsid w:val="004D757A"/>
+    <w:rPr>
+      <w:rFonts w:asciiTheme="majorHAnsi" w:eastAsiaTheme="majorEastAsia" w:hAnsiTheme="majorHAnsi" w:cstheme="majorBidi"/>
+      <w:sz w:val="40"/>
+      <w:szCs w:val="40"/>
+    </w:rPr>
   </w:style>
-  <w:style w:type="character" w:styleId="Hipercze">
+  <w:style w:type="character" w:styleId="Hyperlink">
     <w:name w:val="Hyperlink"/>
-    <w:basedOn w:val="Domylnaczcionkaakapitu"/>
+    <w:basedOn w:val="DefaultParagraphFont"/>
     <w:uiPriority w:val="99"/>
     <w:unhideWhenUsed/>
     <w:rsid w:val="0077791B"/>
@@ -4026,9 +4160,9 @@
       <w:u w:val="single"/>
     </w:rPr>
   </w:style>
-  <w:style w:type="paragraph" w:styleId="Akapitzlist">
+  <w:style w:type="paragraph" w:styleId="ListParagraph">
     <w:name w:val="List Paragraph"/>
-    <w:basedOn w:val="Normalny"/>
+    <w:basedOn w:val="Normal"/>
     <w:uiPriority w:val="34"/>
     <w:qFormat/>
     <w:rsid w:val="00850B0A"/>
@@ -4037,9 +4171,9 @@
       <w:contextualSpacing/>
     </w:pPr>
   </w:style>
-  <w:style w:type="character" w:styleId="Wyrnienieintensywne">
+  <w:style w:type="character" w:styleId="IntenseEmphasis">
     <w:name w:val="Intense Emphasis"/>
-    <w:basedOn w:val="Domylnaczcionkaakapitu"/>
+    <w:basedOn w:val="DefaultParagraphFont"/>
     <w:uiPriority w:val="21"/>
     <w:qFormat/>
     <w:rsid w:val="00850B0A"/>
@@ -4049,9 +4183,9 @@
       <w:color w:val="0F4761" w:themeColor="accent1" w:themeShade="BF"/>
     </w:rPr>
   </w:style>
-  <w:style w:type="character" w:styleId="Odwoanieintensywne">
+  <w:style w:type="character" w:styleId="IntenseReference">
     <w:name w:val="Intense Reference"/>
-    <w:basedOn w:val="Domylnaczcionkaakapitu"/>
+    <w:basedOn w:val="DefaultParagraphFont"/>
     <w:uiPriority w:val="32"/>
     <w:qFormat/>
     <w:rsid w:val="00850B0A"/>
@@ -4063,7 +4197,7 @@
       <w:spacing w:val="5"/>
     </w:rPr>
   </w:style>
-  <w:style w:type="table" w:styleId="Tabela-Siatka">
+  <w:style w:type="table" w:styleId="TableGrid">
     <w:name w:val="Table Grid"/>
     <w:basedOn w:val="TableNormal"/>
     <w:uiPriority w:val="39"/>
@@ -4082,21 +4216,9 @@
       </w:tblBorders>
     </w:tblPr>
   </w:style>
-  <w:style w:type="character" w:customStyle="1" w:styleId="Nagwek1Znak">
-    <w:name w:val="Nagłówek 1 Znak"/>
-    <w:basedOn w:val="Domylnaczcionkaakapitu"/>
-    <w:link w:val="Nagwek1"/>
-    <w:uiPriority w:val="9"/>
-    <w:rsid w:val="004D757A"/>
-    <w:rPr>
-      <w:rFonts w:asciiTheme="majorHAnsi" w:eastAsiaTheme="majorEastAsia" w:hAnsiTheme="majorHAnsi" w:cstheme="majorBidi"/>
-      <w:sz w:val="40"/>
-      <w:szCs w:val="40"/>
-    </w:rPr>
-  </w:style>
   <w:style w:type="character" w:customStyle="1" w:styleId="Nagwek2Znak">
     <w:name w:val="Nagłówek 2 Znak"/>
-    <w:basedOn w:val="Domylnaczcionkaakapitu"/>
+    <w:basedOn w:val="DefaultParagraphFont"/>
     <w:uiPriority w:val="9"/>
     <w:semiHidden/>
     <w:rsid w:val="004D757A"/>
@@ -4109,7 +4231,7 @@
   </w:style>
   <w:style w:type="character" w:customStyle="1" w:styleId="Nagwek3Znak">
     <w:name w:val="Nagłówek 3 Znak"/>
-    <w:basedOn w:val="Domylnaczcionkaakapitu"/>
+    <w:basedOn w:val="DefaultParagraphFont"/>
     <w:uiPriority w:val="9"/>
     <w:semiHidden/>
     <w:rsid w:val="004D757A"/>
@@ -4122,7 +4244,7 @@
   </w:style>
   <w:style w:type="character" w:customStyle="1" w:styleId="Nagwek4Znak">
     <w:name w:val="Nagłówek 4 Znak"/>
-    <w:basedOn w:val="Domylnaczcionkaakapitu"/>
+    <w:basedOn w:val="DefaultParagraphFont"/>
     <w:uiPriority w:val="9"/>
     <w:semiHidden/>
     <w:rsid w:val="004D757A"/>
@@ -4135,7 +4257,7 @@
   </w:style>
   <w:style w:type="character" w:customStyle="1" w:styleId="Nagwek5Znak">
     <w:name w:val="Nagłówek 5 Znak"/>
-    <w:basedOn w:val="Domylnaczcionkaakapitu"/>
+    <w:basedOn w:val="DefaultParagraphFont"/>
     <w:uiPriority w:val="9"/>
     <w:semiHidden/>
     <w:rsid w:val="004D757A"/>
@@ -4146,7 +4268,7 @@
   </w:style>
   <w:style w:type="character" w:customStyle="1" w:styleId="Nagwek6Znak">
     <w:name w:val="Nagłówek 6 Znak"/>
-    <w:basedOn w:val="Domylnaczcionkaakapitu"/>
+    <w:basedOn w:val="DefaultParagraphFont"/>
     <w:uiPriority w:val="9"/>
     <w:semiHidden/>
     <w:rsid w:val="004D757A"/>
@@ -4159,7 +4281,7 @@
   </w:style>
   <w:style w:type="character" w:customStyle="1" w:styleId="Nagwek7Znak">
     <w:name w:val="Nagłówek 7 Znak"/>
-    <w:basedOn w:val="Domylnaczcionkaakapitu"/>
+    <w:basedOn w:val="DefaultParagraphFont"/>
     <w:uiPriority w:val="9"/>
     <w:semiHidden/>
     <w:rsid w:val="004D757A"/>
@@ -4170,7 +4292,7 @@
   </w:style>
   <w:style w:type="character" w:customStyle="1" w:styleId="Nagwek8Znak">
     <w:name w:val="Nagłówek 8 Znak"/>
-    <w:basedOn w:val="Domylnaczcionkaakapitu"/>
+    <w:basedOn w:val="DefaultParagraphFont"/>
     <w:uiPriority w:val="9"/>
     <w:semiHidden/>
     <w:rsid w:val="004D757A"/>
@@ -4183,7 +4305,7 @@
   </w:style>
   <w:style w:type="character" w:customStyle="1" w:styleId="Nagwek9Znak">
     <w:name w:val="Nagłówek 9 Znak"/>
-    <w:basedOn w:val="Domylnaczcionkaakapitu"/>
+    <w:basedOn w:val="DefaultParagraphFont"/>
     <w:uiPriority w:val="9"/>
     <w:semiHidden/>
     <w:rsid w:val="004D757A"/>
@@ -4194,7 +4316,7 @@
   </w:style>
   <w:style w:type="character" w:customStyle="1" w:styleId="TytuZnak">
     <w:name w:val="Tytuł Znak"/>
-    <w:basedOn w:val="Domylnaczcionkaakapitu"/>
+    <w:basedOn w:val="DefaultParagraphFont"/>
     <w:uiPriority w:val="10"/>
     <w:rsid w:val="004D757A"/>
     <w:rPr>
@@ -4207,7 +4329,7 @@
   </w:style>
   <w:style w:type="character" w:customStyle="1" w:styleId="PodtytuZnak">
     <w:name w:val="Podtytuł Znak"/>
-    <w:basedOn w:val="Domylnaczcionkaakapitu"/>
+    <w:basedOn w:val="DefaultParagraphFont"/>
     <w:uiPriority w:val="11"/>
     <w:rsid w:val="004D757A"/>
     <w:rPr>
@@ -4220,7 +4342,7 @@
   </w:style>
   <w:style w:type="character" w:customStyle="1" w:styleId="CytatZnak">
     <w:name w:val="Cytat Znak"/>
-    <w:basedOn w:val="Domylnaczcionkaakapitu"/>
+    <w:basedOn w:val="DefaultParagraphFont"/>
     <w:uiPriority w:val="29"/>
     <w:rsid w:val="004D757A"/>
     <w:rPr>
@@ -4231,7 +4353,7 @@
   </w:style>
   <w:style w:type="character" w:customStyle="1" w:styleId="CytatintensywnyZnak">
     <w:name w:val="Cytat intensywny Znak"/>
-    <w:basedOn w:val="Domylnaczcionkaakapitu"/>
+    <w:basedOn w:val="DefaultParagraphFont"/>
     <w:uiPriority w:val="30"/>
     <w:rsid w:val="004D757A"/>
     <w:rPr>
@@ -4559,18 +4681,6 @@
 </file>
 
 <file path=customXml/item1.xml><?xml version="1.0" encoding="utf-8"?>
-<b:Sources xmlns:b="http://schemas.openxmlformats.org/officeDocument/2006/bibliography" xmlns="http://schemas.openxmlformats.org/officeDocument/2006/bibliography" SelectedStyle="\APASixthEditionOfficeOnline.xsl" StyleName="APA" Version="6"/>
-</file>
-
-<file path=customXml/item2.xml><?xml version="1.0" encoding="utf-8"?>
-<p:properties xmlns:p="http://schemas.microsoft.com/office/2006/metadata/properties" xmlns:xsi="http://www.w3.org/2001/XMLSchema-instance" xmlns:pc="http://schemas.microsoft.com/office/infopath/2007/PartnerControls">
-  <documentManagement>
-    <_activity xmlns="01a094b0-08a8-443b-bd9d-7d2701d1cf8a" xsi:nil="true"/>
-  </documentManagement>
-</p:properties>
-</file>
-
-<file path=customXml/item3.xml><?xml version="1.0" encoding="utf-8"?>
 <?mso-contentType ?>
 <FormTemplates xmlns="http://schemas.microsoft.com/sharepoint/v3/contenttype/forms">
   <Display>DocumentLibraryForm</Display>
@@ -4579,7 +4689,7 @@
 </FormTemplates>
 </file>
 
-<file path=customXml/item4.xml><?xml version="1.0" encoding="utf-8"?>
+<file path=customXml/item2.xml><?xml version="1.0" encoding="utf-8"?>
 <ct:contentTypeSchema xmlns:ct="http://schemas.microsoft.com/office/2006/metadata/contentType" xmlns:ma="http://schemas.microsoft.com/office/2006/metadata/properties/metaAttributes" ct:_="" ma:_="" ma:contentTypeName="Dokument" ma:contentTypeID="0x010100CCB42EE1A2101A46A529E33B73FA5B9E" ma:contentTypeVersion="6" ma:contentTypeDescription="Utwórz nowy dokument." ma:contentTypeScope="" ma:versionID="18976c67d36d6dbfaddc4b6a42a3b266">
   <xsd:schema xmlns:xsd="http://www.w3.org/2001/XMLSchema" xmlns:xs="http://www.w3.org/2001/XMLSchema" xmlns:p="http://schemas.microsoft.com/office/2006/metadata/properties" xmlns:ns3="01a094b0-08a8-443b-bd9d-7d2701d1cf8a" targetNamespace="http://schemas.microsoft.com/office/2006/metadata/properties" ma:root="true" ma:fieldsID="3b2386cc71632d5df78aeaf6a90f017e" ns3:_="">
     <xsd:import namespace="01a094b0-08a8-443b-bd9d-7d2701d1cf8a"/>
@@ -4735,25 +4845,19 @@
 </ct:contentTypeSchema>
 </file>
 
-<file path=customXml/itemProps1.xml><?xml version="1.0" encoding="utf-8"?>
-<ds:datastoreItem xmlns:ds="http://schemas.openxmlformats.org/officeDocument/2006/customXml" ds:itemID="{492705AE-1BBD-440B-B6CF-958A01E137F6}">
-  <ds:schemaRefs>
-    <ds:schemaRef ds:uri="http://schemas.openxmlformats.org/officeDocument/2006/bibliography"/>
-  </ds:schemaRefs>
-</ds:datastoreItem>
+<file path=customXml/item3.xml><?xml version="1.0" encoding="utf-8"?>
+<b:Sources xmlns:b="http://schemas.openxmlformats.org/officeDocument/2006/bibliography" xmlns="http://schemas.openxmlformats.org/officeDocument/2006/bibliography" SelectedStyle="\APASixthEditionOfficeOnline.xsl" StyleName="APA" Version="6"/>
 </file>
 
-<file path=customXml/itemProps2.xml><?xml version="1.0" encoding="utf-8"?>
-<ds:datastoreItem xmlns:ds="http://schemas.openxmlformats.org/officeDocument/2006/customXml" ds:itemID="{46053FE0-993E-40B0-B62B-CC401A1C0483}">
-  <ds:schemaRefs>
-    <ds:schemaRef ds:uri="http://schemas.microsoft.com/office/2006/metadata/properties"/>
-    <ds:schemaRef ds:uri="http://schemas.microsoft.com/office/infopath/2007/PartnerControls"/>
-    <ds:schemaRef ds:uri="01a094b0-08a8-443b-bd9d-7d2701d1cf8a"/>
-  </ds:schemaRefs>
-</ds:datastoreItem>
+<file path=customXml/item4.xml><?xml version="1.0" encoding="utf-8"?>
+<p:properties xmlns:p="http://schemas.microsoft.com/office/2006/metadata/properties" xmlns:xsi="http://www.w3.org/2001/XMLSchema-instance" xmlns:pc="http://schemas.microsoft.com/office/infopath/2007/PartnerControls">
+  <documentManagement>
+    <_activity xmlns="01a094b0-08a8-443b-bd9d-7d2701d1cf8a" xsi:nil="true"/>
+  </documentManagement>
+</p:properties>
 </file>
 
-<file path=customXml/itemProps3.xml><?xml version="1.0" encoding="utf-8"?>
+<file path=customXml/itemProps1.xml><?xml version="1.0" encoding="utf-8"?>
 <ds:datastoreItem xmlns:ds="http://schemas.openxmlformats.org/officeDocument/2006/customXml" ds:itemID="{1732424E-DCE3-4042-88F3-7B73E5580075}">
   <ds:schemaRefs>
     <ds:schemaRef ds:uri="http://schemas.microsoft.com/sharepoint/v3/contenttype/forms"/>
@@ -4761,7 +4865,7 @@
 </ds:datastoreItem>
 </file>
 
-<file path=customXml/itemProps4.xml><?xml version="1.0" encoding="utf-8"?>
+<file path=customXml/itemProps2.xml><?xml version="1.0" encoding="utf-8"?>
 <ds:datastoreItem xmlns:ds="http://schemas.openxmlformats.org/officeDocument/2006/customXml" ds:itemID="{E1DDB39E-244E-4482-BAB5-D3E1A5502C4D}">
   <ds:schemaRefs>
     <ds:schemaRef ds:uri="http://schemas.microsoft.com/office/2006/metadata/contentType"/>
@@ -4777,4 +4881,22 @@
     <ds:schemaRef ds:uri="http://schemas.microsoft.com/internal/obd"/>
   </ds:schemaRefs>
 </ds:datastoreItem>
+</file>
+
+<file path=customXml/itemProps3.xml><?xml version="1.0" encoding="utf-8"?>
+<ds:datastoreItem xmlns:ds="http://schemas.openxmlformats.org/officeDocument/2006/customXml" ds:itemID="{492705AE-1BBD-440B-B6CF-958A01E137F6}">
+  <ds:schemaRefs>
+    <ds:schemaRef ds:uri="http://schemas.openxmlformats.org/officeDocument/2006/bibliography"/>
+  </ds:schemaRefs>
+</ds:datastoreItem>
+</file>
+
+<file path=customXml/itemProps4.xml><?xml version="1.0" encoding="utf-8"?>
+<ds:datastoreItem xmlns:ds="http://schemas.openxmlformats.org/officeDocument/2006/customXml" ds:itemID="{46053FE0-993E-40B0-B62B-CC401A1C0483}">
+  <ds:schemaRefs>
+    <ds:schemaRef ds:uri="http://schemas.microsoft.com/office/2006/metadata/properties"/>
+    <ds:schemaRef ds:uri="http://schemas.microsoft.com/office/infopath/2007/PartnerControls"/>
+    <ds:schemaRef ds:uri="01a094b0-08a8-443b-bd9d-7d2701d1cf8a"/>
+  </ds:schemaRefs>
+</ds:datastoreItem>
 </file>
</xml_diff>